<commit_message>
feat: address review — viewpoint relations, case modeling, rubric calibration
- Agent 1 now extracts viewpoint-to-viewpoint relations (causal/progressive/contrast)
  turning flat JSON list into a traceable logic chain; at least 3 pairs required
- Cases modeled as first-class objects (background/action/result + completeness),
  at least 3 viewpoints with case; UI shows 3-part case with completeness badge
- Rubric gains operational calibration: how to score, what to measure, pass line
  (e.g. Agent3 style >=4/5, evidence traceback 100%, AI-flavor openings <=1)
- detail-modal renders relations + case; mock-data & samples/viewpoints.json synced
- solution_design.md and generated docx updated (tsc clean, 45 tests pass)
</commit_message>
<xml_diff>
--- a/docs/solution_design.docx
+++ b/docs/solution_design.docx
@@ -827,6 +827,770 @@
           <w:sz w:val="18"/>
         </w:rPr>
         <w:t>}</w:t>
+      </w:r>
+    </w:p>
+    <w:p>
+      <w:pPr>
+        <w:pStyle w:val="Heading2"/>
+        <w:spacing w:before="200" w:after="80"/>
+      </w:pPr>
+      <w:r>
+        <w:rPr>
+          <w:rFonts w:ascii="微软雅黑" w:hAnsi="微软雅黑" w:eastAsia="微软雅黑"/>
+          <w:b/>
+          <w:color w:val="1F3A5F"/>
+          <w:sz w:val="26"/>
+        </w:rPr>
+        <w:t>因果链建模（causalChain）</w:t>
+      </w:r>
+    </w:p>
+    <w:p>
+      <w:pPr>
+        <w:spacing w:after="120"/>
+      </w:pPr>
+      <w:r>
+        <w:rPr>
+          <w:rFonts w:ascii="微软雅黑" w:hAnsi="微软雅黑" w:eastAsia="微软雅黑"/>
+          <w:sz w:val="21"/>
+        </w:rPr>
+        <w:t>嘉宾观点的价值往往藏在论证过程里，而不是结论本身。Agent 1 在提取观点时同步提取因果链，让编辑一眼看到“前提 → 推理 → 结论”的论证骨架，而不是被口语化的跳跃表达淹没。</w:t>
+      </w:r>
+    </w:p>
+    <w:p>
+      <w:pPr>
+        <w:spacing w:after="120"/>
+      </w:pPr>
+      <w:r>
+        <w:rPr>
+          <w:rFonts w:ascii="微软雅黑" w:hAnsi="微软雅黑" w:eastAsia="微软雅黑"/>
+          <w:b/>
+          <w:sz w:val="21"/>
+        </w:rPr>
+        <w:t>提取判断标准</w:t>
+      </w:r>
+      <w:r>
+        <w:rPr>
+          <w:rFonts w:ascii="微软雅黑" w:hAnsi="微软雅黑" w:eastAsia="微软雅黑"/>
+          <w:sz w:val="21"/>
+        </w:rPr>
+        <w:t>（只有包含因果推理才提取；纯事实陈述或纯行动建议填 null）：</w:t>
+      </w:r>
+    </w:p>
+    <w:p>
+      <w:pPr>
+        <w:pStyle w:val="ListBullet"/>
+        <w:spacing w:after="40"/>
+      </w:pPr>
+      <w:r>
+        <w:rPr>
+          <w:rFonts w:ascii="微软雅黑" w:hAnsi="微软雅黑" w:eastAsia="微软雅黑"/>
+          <w:sz w:val="21"/>
+        </w:rPr>
+        <w:t>嘉宾说“因为X，所以Y” → 有因果</w:t>
+      </w:r>
+    </w:p>
+    <w:p>
+      <w:pPr>
+        <w:pStyle w:val="ListBullet"/>
+        <w:spacing w:after="40"/>
+      </w:pPr>
+      <w:r>
+        <w:rPr>
+          <w:rFonts w:ascii="微软雅黑" w:hAnsi="微软雅黑" w:eastAsia="微软雅黑"/>
+          <w:sz w:val="21"/>
+        </w:rPr>
+        <w:t>嘉宾说“如果不X，就会Y” → 有因果</w:t>
+      </w:r>
+    </w:p>
+    <w:p>
+      <w:pPr>
+        <w:pStyle w:val="ListBullet"/>
+        <w:spacing w:after="40"/>
+      </w:pPr>
+      <w:r>
+        <w:rPr>
+          <w:rFonts w:ascii="微软雅黑" w:hAnsi="微软雅黑" w:eastAsia="微软雅黑"/>
+          <w:sz w:val="21"/>
+        </w:rPr>
+        <w:t>嘉宾说“X导致了Y，所以我们需要Z” → 有因果</w:t>
+      </w:r>
+    </w:p>
+    <w:p>
+      <w:pPr>
+        <w:pStyle w:val="ListBullet"/>
+        <w:spacing w:after="40"/>
+      </w:pPr>
+      <w:r>
+        <w:rPr>
+          <w:rFonts w:ascii="微软雅黑" w:hAnsi="微软雅黑" w:eastAsia="微软雅黑"/>
+          <w:sz w:val="21"/>
+        </w:rPr>
+        <w:t>嘉宾说“以前是A，现在是B，这意味着C” → 有因果</w:t>
+      </w:r>
+    </w:p>
+    <w:p>
+      <w:pPr>
+        <w:pStyle w:val="ListBullet"/>
+        <w:spacing w:after="40"/>
+      </w:pPr>
+      <w:r>
+        <w:rPr>
+          <w:rFonts w:ascii="微软雅黑" w:hAnsi="微软雅黑" w:eastAsia="微软雅黑"/>
+          <w:sz w:val="21"/>
+        </w:rPr>
+        <w:t>嘉宾只是描述事实“X公司做了Y产品” → 无因果，填 null</w:t>
+      </w:r>
+    </w:p>
+    <w:p>
+      <w:pPr>
+        <w:pStyle w:val="ListBullet"/>
+        <w:spacing w:after="40"/>
+      </w:pPr>
+      <w:r>
+        <w:rPr>
+          <w:rFonts w:ascii="微软雅黑" w:hAnsi="微软雅黑" w:eastAsia="微软雅黑"/>
+          <w:sz w:val="21"/>
+        </w:rPr>
+        <w:t>嘉宾只是给建议“你应该去试试Z” → 无因果，填 null</w:t>
+      </w:r>
+    </w:p>
+    <w:p>
+      <w:pPr>
+        <w:spacing w:after="120"/>
+      </w:pPr>
+      <w:r>
+        <w:rPr>
+          <w:rFonts w:ascii="微软雅黑" w:hAnsi="微软雅黑" w:eastAsia="微软雅黑"/>
+          <w:b/>
+          <w:sz w:val="21"/>
+        </w:rPr>
+        <w:t>结构</w:t>
+      </w:r>
+      <w:r>
+        <w:rPr>
+          <w:rFonts w:ascii="微软雅黑" w:hAnsi="微软雅黑" w:eastAsia="微软雅黑"/>
+          <w:sz w:val="21"/>
+        </w:rPr>
+        <w:t>：</w:t>
+      </w:r>
+    </w:p>
+    <w:p>
+      <w:pPr>
+        <w:shd w:val="clear" w:fill="F2F2F2"/>
+        <w:spacing w:after="0"/>
+        <w:ind w:left="113"/>
+      </w:pPr>
+      <w:r>
+        <w:rPr>
+          <w:rFonts w:ascii="Consolas" w:hAnsi="Consolas" w:eastAsia="Consolas"/>
+          <w:sz w:val="18"/>
+        </w:rPr>
+        <w:t>{</w:t>
+      </w:r>
+    </w:p>
+    <w:p>
+      <w:pPr>
+        <w:shd w:val="clear" w:fill="F2F2F2"/>
+        <w:spacing w:after="0"/>
+        <w:ind w:left="113"/>
+      </w:pPr>
+      <w:r>
+        <w:rPr>
+          <w:rFonts w:ascii="Consolas" w:hAnsi="Consolas" w:eastAsia="Consolas"/>
+          <w:sz w:val="18"/>
+        </w:rPr>
+        <w:t xml:space="preserve">  "premise": "前提",</w:t>
+      </w:r>
+    </w:p>
+    <w:p>
+      <w:pPr>
+        <w:shd w:val="clear" w:fill="F2F2F2"/>
+        <w:spacing w:after="0"/>
+        <w:ind w:left="113"/>
+      </w:pPr>
+      <w:r>
+        <w:rPr>
+          <w:rFonts w:ascii="Consolas" w:hAnsi="Consolas" w:eastAsia="Consolas"/>
+          <w:sz w:val="18"/>
+        </w:rPr>
+        <w:t xml:space="preserve">  "reasoning": "推理过程",</w:t>
+      </w:r>
+    </w:p>
+    <w:p>
+      <w:pPr>
+        <w:shd w:val="clear" w:fill="F2F2F2"/>
+        <w:spacing w:after="0"/>
+        <w:ind w:left="113"/>
+      </w:pPr>
+      <w:r>
+        <w:rPr>
+          <w:rFonts w:ascii="Consolas" w:hAnsi="Consolas" w:eastAsia="Consolas"/>
+          <w:sz w:val="18"/>
+        </w:rPr>
+        <w:t xml:space="preserve">  "conclusion": "结论",</w:t>
+      </w:r>
+    </w:p>
+    <w:p>
+      <w:pPr>
+        <w:shd w:val="clear" w:fill="F2F2F2"/>
+        <w:spacing w:after="0"/>
+        <w:ind w:left="113"/>
+      </w:pPr>
+      <w:r>
+        <w:rPr>
+          <w:rFonts w:ascii="Consolas" w:hAnsi="Consolas" w:eastAsia="Consolas"/>
+          <w:sz w:val="18"/>
+        </w:rPr>
+        <w:t xml:space="preserve">  "evidence": [{ "segment": "说话人 时间戳", "text": "支撑因果链的原文" }],</w:t>
+      </w:r>
+    </w:p>
+    <w:p>
+      <w:pPr>
+        <w:shd w:val="clear" w:fill="F2F2F2"/>
+        <w:spacing w:after="0"/>
+        <w:ind w:left="113"/>
+      </w:pPr>
+      <w:r>
+        <w:rPr>
+          <w:rFonts w:ascii="Consolas" w:hAnsi="Consolas" w:eastAsia="Consolas"/>
+          <w:sz w:val="18"/>
+        </w:rPr>
+        <w:t xml:space="preserve">  "missingSteps": ["这个因果链还缺什么？编辑应该注意什么逻辑断点？"]</w:t>
+      </w:r>
+    </w:p>
+    <w:p>
+      <w:pPr>
+        <w:shd w:val="clear" w:fill="F2F2F2"/>
+        <w:spacing w:after="120"/>
+        <w:ind w:left="113"/>
+      </w:pPr>
+      <w:r>
+        <w:rPr>
+          <w:rFonts w:ascii="Consolas" w:hAnsi="Consolas" w:eastAsia="Consolas"/>
+          <w:sz w:val="18"/>
+        </w:rPr>
+        <w:t>}</w:t>
+      </w:r>
+    </w:p>
+    <w:p>
+      <w:pPr>
+        <w:spacing w:after="120"/>
+      </w:pPr>
+      <w:r>
+        <w:rPr>
+          <w:rFonts w:ascii="微软雅黑" w:hAnsi="微软雅黑" w:eastAsia="微软雅黑"/>
+          <w:sz w:val="21"/>
+        </w:rPr>
+        <w:t>Prompt 要求至少 5 个观点带 causalChain——大多数嘉宾观点都包含因果推理。</w:t>
+      </w:r>
+    </w:p>
+    <w:p>
+      <w:pPr>
+        <w:spacing w:after="120"/>
+      </w:pPr>
+      <w:r>
+        <w:rPr>
+          <w:rFonts w:ascii="微软雅黑" w:hAnsi="微软雅黑" w:eastAsia="微软雅黑"/>
+          <w:b/>
+          <w:sz w:val="21"/>
+        </w:rPr>
+        <w:t>前端呈现与编辑价值</w:t>
+      </w:r>
+      <w:r>
+        <w:rPr>
+          <w:rFonts w:ascii="微软雅黑" w:hAnsi="微软雅黑" w:eastAsia="微软雅黑"/>
+          <w:sz w:val="21"/>
+        </w:rPr>
+        <w:t>：观点详情弹窗中，因果链以蓝色递进箭头展示“前提 → 推理 → 结论”，每条链附证据原文；</w:t>
+      </w:r>
+      <w:r>
+        <w:rPr>
+          <w:rFonts w:ascii="微软雅黑" w:hAnsi="微软雅黑" w:eastAsia="微软雅黑"/>
+          <w:sz w:val="21"/>
+        </w:rPr>
+        <w:t>missingSteps</w:t>
+      </w:r>
+      <w:r>
+        <w:rPr>
+          <w:rFonts w:ascii="微软雅黑" w:hAnsi="微软雅黑" w:eastAsia="微软雅黑"/>
+          <w:sz w:val="21"/>
+        </w:rPr>
+        <w:t xml:space="preserve"> 以琥珀色“推理链断点”警示。这正面回应了题目强调的痛点——“AI 容易遗漏关键因果、把嘉宾的口语表达写得过满”：因果链让编辑直接看到论证的完整性与断点，决定是否补足或删减，而不是让 AI 在生成时自行脑补缺失环节。</w:t>
+      </w:r>
+    </w:p>
+    <w:p>
+      <w:pPr>
+        <w:pStyle w:val="Heading2"/>
+        <w:spacing w:before="200" w:after="80"/>
+      </w:pPr>
+      <w:r>
+        <w:rPr>
+          <w:rFonts w:ascii="微软雅黑" w:hAnsi="微软雅黑" w:eastAsia="微软雅黑"/>
+          <w:b/>
+          <w:color w:val="1F3A5F"/>
+          <w:sz w:val="26"/>
+        </w:rPr>
+        <w:t>观点间关系建模（relations，逻辑链）</w:t>
+      </w:r>
+    </w:p>
+    <w:p>
+      <w:pPr>
+        <w:spacing w:after="120"/>
+      </w:pPr>
+      <w:r>
+        <w:rPr>
+          <w:rFonts w:ascii="微软雅黑" w:hAnsi="微软雅黑" w:eastAsia="微软雅黑"/>
+          <w:sz w:val="21"/>
+        </w:rPr>
+        <w:t>因果链解决“一个观点内部的论证”，relations 解决</w:t>
+      </w:r>
+      <w:r>
+        <w:rPr>
+          <w:rFonts w:ascii="微软雅黑" w:hAnsi="微软雅黑" w:eastAsia="微软雅黑"/>
+          <w:b/>
+          <w:sz w:val="21"/>
+        </w:rPr>
+        <w:t>观点与观点之间的逻辑关系</w:t>
+      </w:r>
+      <w:r>
+        <w:rPr>
+          <w:rFonts w:ascii="微软雅黑" w:hAnsi="微软雅黑" w:eastAsia="微软雅黑"/>
+          <w:sz w:val="21"/>
+        </w:rPr>
+        <w:t>。Agent 1 提取完观点后，为有明确逻辑关系的观点对添加 relations，把扁平的 JSON 列表变成可追溯的逻辑链：</w:t>
+      </w:r>
+    </w:p>
+    <w:p>
+      <w:pPr>
+        <w:pStyle w:val="ListBullet"/>
+        <w:spacing w:after="40"/>
+      </w:pPr>
+      <w:r>
+        <w:rPr>
+          <w:rFonts w:ascii="微软雅黑" w:hAnsi="微软雅黑" w:eastAsia="微软雅黑"/>
+          <w:b/>
+          <w:sz w:val="21"/>
+        </w:rPr>
+        <w:t>causal（因果）</w:t>
+      </w:r>
+      <w:r>
+        <w:rPr>
+          <w:rFonts w:ascii="微软雅黑" w:hAnsi="微软雅黑" w:eastAsia="微软雅黑"/>
+          <w:sz w:val="21"/>
+        </w:rPr>
+        <w:t>：vp_A 是 vp_B 的前提/原因——“因为A，所以B”跨观点的推导</w:t>
+      </w:r>
+    </w:p>
+    <w:p>
+      <w:pPr>
+        <w:pStyle w:val="ListBullet"/>
+        <w:spacing w:after="40"/>
+      </w:pPr>
+      <w:r>
+        <w:rPr>
+          <w:rFonts w:ascii="微软雅黑" w:hAnsi="微软雅黑" w:eastAsia="微软雅黑"/>
+          <w:b/>
+          <w:sz w:val="21"/>
+        </w:rPr>
+        <w:t>progressive（递进）</w:t>
+      </w:r>
+      <w:r>
+        <w:rPr>
+          <w:rFonts w:ascii="微软雅黑" w:hAnsi="微软雅黑" w:eastAsia="微软雅黑"/>
+          <w:sz w:val="21"/>
+        </w:rPr>
+        <w:t>：vp_B 是 vp_A 的深化/延伸——先讲现象，再讲机制，再讲怎么办</w:t>
+      </w:r>
+    </w:p>
+    <w:p>
+      <w:pPr>
+        <w:pStyle w:val="ListBullet"/>
+        <w:spacing w:after="40"/>
+      </w:pPr>
+      <w:r>
+        <w:rPr>
+          <w:rFonts w:ascii="微软雅黑" w:hAnsi="微软雅黑" w:eastAsia="微软雅黑"/>
+          <w:b/>
+          <w:sz w:val="21"/>
+        </w:rPr>
+        <w:t>contrast（对比）</w:t>
+      </w:r>
+      <w:r>
+        <w:rPr>
+          <w:rFonts w:ascii="微软雅黑" w:hAnsi="微软雅黑" w:eastAsia="微软雅黑"/>
+          <w:sz w:val="21"/>
+        </w:rPr>
+        <w:t>：vp_B 与 vp_A 构成对立或张力——两位嘉宾观点冲突，或同一嘉宾的“反常识”对照</w:t>
+      </w:r>
+    </w:p>
+    <w:p>
+      <w:pPr>
+        <w:spacing w:after="120"/>
+      </w:pPr>
+      <w:r>
+        <w:rPr>
+          <w:rFonts w:ascii="微软雅黑" w:hAnsi="微软雅黑" w:eastAsia="微软雅黑"/>
+          <w:b/>
+          <w:sz w:val="21"/>
+        </w:rPr>
+        <w:t>结构</w:t>
+      </w:r>
+      <w:r>
+        <w:rPr>
+          <w:rFonts w:ascii="微软雅黑" w:hAnsi="微软雅黑" w:eastAsia="微软雅黑"/>
+          <w:sz w:val="21"/>
+        </w:rPr>
+        <w:t>（每个观点节点的 relations 字段）：</w:t>
+      </w:r>
+    </w:p>
+    <w:p>
+      <w:pPr>
+        <w:shd w:val="clear" w:fill="F2F2F2"/>
+        <w:spacing w:after="0"/>
+        <w:ind w:left="113"/>
+      </w:pPr>
+      <w:r>
+        <w:rPr>
+          <w:rFonts w:ascii="Consolas" w:hAnsi="Consolas" w:eastAsia="Consolas"/>
+          <w:sz w:val="18"/>
+        </w:rPr>
+        <w:t>"relations": [</w:t>
+      </w:r>
+    </w:p>
+    <w:p>
+      <w:pPr>
+        <w:shd w:val="clear" w:fill="F2F2F2"/>
+        <w:spacing w:after="0"/>
+        <w:ind w:left="113"/>
+      </w:pPr>
+      <w:r>
+        <w:rPr>
+          <w:rFonts w:ascii="Consolas" w:hAnsi="Consolas" w:eastAsia="Consolas"/>
+          <w:sz w:val="18"/>
+        </w:rPr>
+        <w:t xml:space="preserve">  { "targetId": "vp_12", "type": "causal", "reason": "工业革命从未自动化劳动而是改变技能结构——这正是今天不适应新技术者收入下降的历史原因" }</w:t>
+      </w:r>
+    </w:p>
+    <w:p>
+      <w:pPr>
+        <w:shd w:val="clear" w:fill="F2F2F2"/>
+        <w:spacing w:after="120"/>
+        <w:ind w:left="113"/>
+      </w:pPr>
+      <w:r>
+        <w:rPr>
+          <w:rFonts w:ascii="Consolas" w:hAnsi="Consolas" w:eastAsia="Consolas"/>
+          <w:sz w:val="18"/>
+        </w:rPr>
+        <w:t>]</w:t>
+      </w:r>
+    </w:p>
+    <w:p>
+      <w:pPr>
+        <w:spacing w:after="120"/>
+      </w:pPr>
+      <w:r>
+        <w:rPr>
+          <w:rFonts w:ascii="微软雅黑" w:hAnsi="微软雅黑" w:eastAsia="微软雅黑"/>
+          <w:sz w:val="21"/>
+        </w:rPr>
+        <w:t>Prompt 要求至少 3 对关系，只标注逐字稿中明确可判断的关系，不硬凑。</w:t>
+      </w:r>
+    </w:p>
+    <w:p>
+      <w:pPr>
+        <w:spacing w:after="120"/>
+      </w:pPr>
+      <w:r>
+        <w:rPr>
+          <w:rFonts w:ascii="微软雅黑" w:hAnsi="微软雅黑" w:eastAsia="微软雅黑"/>
+          <w:b/>
+          <w:sz w:val="21"/>
+        </w:rPr>
+        <w:t>编辑价值</w:t>
+      </w:r>
+      <w:r>
+        <w:rPr>
+          <w:rFonts w:ascii="微软雅黑" w:hAnsi="微软雅黑" w:eastAsia="微软雅黑"/>
+          <w:sz w:val="21"/>
+        </w:rPr>
+        <w:t>：文章结构不能是观点的随意堆叠。relations 让编辑一眼看到哪些观点是“前提”、哪些是“结论”、哪些构成张力——搭结构时自然形成递进或对比，而不是平铺。Agent 3 生成初稿时也会据此把有因果关系的观点组织进同一段落，避免“观点之间没有逻辑勾连”的 AI 味。</w:t>
+      </w:r>
+    </w:p>
+    <w:p>
+      <w:pPr>
+        <w:pStyle w:val="Heading2"/>
+        <w:spacing w:before="200" w:after="80"/>
+      </w:pPr>
+      <w:r>
+        <w:rPr>
+          <w:rFonts w:ascii="微软雅黑" w:hAnsi="微软雅黑" w:eastAsia="微软雅黑"/>
+          <w:b/>
+          <w:color w:val="1F3A5F"/>
+          <w:sz w:val="26"/>
+        </w:rPr>
+        <w:t>案例独立建模（case）</w:t>
+      </w:r>
+    </w:p>
+    <w:p>
+      <w:pPr>
+        <w:spacing w:after="120"/>
+      </w:pPr>
+      <w:r>
+        <w:rPr>
+          <w:rFonts w:ascii="微软雅黑" w:hAnsi="微软雅黑" w:eastAsia="微软雅黑"/>
+          <w:sz w:val="21"/>
+        </w:rPr>
+        <w:t>商业内容最有说服力的部分是案例，但案例不能只当“证据引用”用。Agent 1 识别嘉宾提到的具体案例（公司实践、个人经历、行业事件），</w:t>
+      </w:r>
+      <w:r>
+        <w:rPr>
+          <w:rFonts w:ascii="微软雅黑" w:hAnsi="微软雅黑" w:eastAsia="微软雅黑"/>
+          <w:b/>
+          <w:sz w:val="21"/>
+        </w:rPr>
+        <w:t>单独建模并标注完整性</w:t>
+      </w:r>
+      <w:r>
+        <w:rPr>
+          <w:rFonts w:ascii="微软雅黑" w:hAnsi="微软雅黑" w:eastAsia="微软雅黑"/>
+          <w:sz w:val="21"/>
+        </w:rPr>
+        <w:t>：</w:t>
+      </w:r>
+    </w:p>
+    <w:p>
+      <w:pPr>
+        <w:pStyle w:val="ListBullet"/>
+        <w:spacing w:after="40"/>
+      </w:pPr>
+      <w:r>
+        <w:rPr>
+          <w:rFonts w:ascii="微软雅黑" w:hAnsi="微软雅黑" w:eastAsia="微软雅黑"/>
+          <w:b/>
+          <w:sz w:val="21"/>
+        </w:rPr>
+        <w:t>background</w:t>
+      </w:r>
+      <w:r>
+        <w:rPr>
+          <w:rFonts w:ascii="微软雅黑" w:hAnsi="微软雅黑" w:eastAsia="微软雅黑"/>
+          <w:sz w:val="21"/>
+        </w:rPr>
+        <w:t>：背景（当事人是谁、什么处境）</w:t>
+      </w:r>
+    </w:p>
+    <w:p>
+      <w:pPr>
+        <w:pStyle w:val="ListBullet"/>
+        <w:spacing w:after="40"/>
+      </w:pPr>
+      <w:r>
+        <w:rPr>
+          <w:rFonts w:ascii="微软雅黑" w:hAnsi="微软雅黑" w:eastAsia="微软雅黑"/>
+          <w:b/>
+          <w:sz w:val="21"/>
+        </w:rPr>
+        <w:t>action</w:t>
+      </w:r>
+      <w:r>
+        <w:rPr>
+          <w:rFonts w:ascii="微软雅黑" w:hAnsi="微软雅黑" w:eastAsia="微软雅黑"/>
+          <w:sz w:val="21"/>
+        </w:rPr>
+        <w:t>：行动（做了什么）</w:t>
+      </w:r>
+    </w:p>
+    <w:p>
+      <w:pPr>
+        <w:pStyle w:val="ListBullet"/>
+        <w:spacing w:after="40"/>
+      </w:pPr>
+      <w:r>
+        <w:rPr>
+          <w:rFonts w:ascii="微软雅黑" w:hAnsi="微软雅黑" w:eastAsia="微软雅黑"/>
+          <w:b/>
+          <w:sz w:val="21"/>
+        </w:rPr>
+        <w:t>result</w:t>
+      </w:r>
+      <w:r>
+        <w:rPr>
+          <w:rFonts w:ascii="微软雅黑" w:hAnsi="微软雅黑" w:eastAsia="微软雅黑"/>
+          <w:sz w:val="21"/>
+        </w:rPr>
+        <w:t>：结果（带来了什么变化）</w:t>
+      </w:r>
+    </w:p>
+    <w:p>
+      <w:pPr>
+        <w:pStyle w:val="ListBullet"/>
+        <w:spacing w:after="40"/>
+      </w:pPr>
+      <w:r>
+        <w:rPr>
+          <w:rFonts w:ascii="微软雅黑" w:hAnsi="微软雅黑" w:eastAsia="微软雅黑"/>
+          <w:b/>
+          <w:sz w:val="21"/>
+        </w:rPr>
+        <w:t>completeness</w:t>
+      </w:r>
+      <w:r>
+        <w:rPr>
+          <w:rFonts w:ascii="微软雅黑" w:hAnsi="微软雅黑" w:eastAsia="微软雅黑"/>
+          <w:sz w:val="21"/>
+        </w:rPr>
+        <w:t>：三要素齐全=complete；缺一个=partial；只言片语无法成案=unknown</w:t>
+      </w:r>
+    </w:p>
+    <w:p>
+      <w:pPr>
+        <w:spacing w:after="120"/>
+      </w:pPr>
+      <w:r>
+        <w:rPr>
+          <w:rFonts w:ascii="微软雅黑" w:hAnsi="微软雅黑" w:eastAsia="微软雅黑"/>
+          <w:b/>
+          <w:sz w:val="21"/>
+        </w:rPr>
+        <w:t>结构</w:t>
+      </w:r>
+      <w:r>
+        <w:rPr>
+          <w:rFonts w:ascii="微软雅黑" w:hAnsi="微软雅黑" w:eastAsia="微软雅黑"/>
+          <w:sz w:val="21"/>
+        </w:rPr>
+        <w:t>（每个观点节点的 case 字段）：</w:t>
+      </w:r>
+    </w:p>
+    <w:p>
+      <w:pPr>
+        <w:shd w:val="clear" w:fill="F2F2F2"/>
+        <w:spacing w:after="0"/>
+        <w:ind w:left="113"/>
+      </w:pPr>
+      <w:r>
+        <w:rPr>
+          <w:rFonts w:ascii="Consolas" w:hAnsi="Consolas" w:eastAsia="Consolas"/>
+          <w:sz w:val="18"/>
+        </w:rPr>
+        <w:t>"case": {</w:t>
+      </w:r>
+    </w:p>
+    <w:p>
+      <w:pPr>
+        <w:shd w:val="clear" w:fill="F2F2F2"/>
+        <w:spacing w:after="0"/>
+        <w:ind w:left="113"/>
+      </w:pPr>
+      <w:r>
+        <w:rPr>
+          <w:rFonts w:ascii="Consolas" w:hAnsi="Consolas" w:eastAsia="Consolas"/>
+          <w:sz w:val="18"/>
+        </w:rPr>
+        <w:t xml:space="preserve">  "background": "嘉宾B是一位CEO，管理整个公司但坚持亲自动手",</w:t>
+      </w:r>
+    </w:p>
+    <w:p>
+      <w:pPr>
+        <w:shd w:val="clear" w:fill="F2F2F2"/>
+        <w:spacing w:after="0"/>
+        <w:ind w:left="113"/>
+      </w:pPr>
+      <w:r>
+        <w:rPr>
+          <w:rFonts w:ascii="Consolas" w:hAnsi="Consolas" w:eastAsia="Consolas"/>
+          <w:sz w:val="18"/>
+        </w:rPr>
+        <w:t xml:space="preserve">  "action": "用AI编程工具自建了整套CEO工具栈",</w:t>
+      </w:r>
+    </w:p>
+    <w:p>
+      <w:pPr>
+        <w:shd w:val="clear" w:fill="F2F2F2"/>
+        <w:spacing w:after="0"/>
+        <w:ind w:left="113"/>
+      </w:pPr>
+      <w:r>
+        <w:rPr>
+          <w:rFonts w:ascii="Consolas" w:hAnsi="Consolas" w:eastAsia="Consolas"/>
+          <w:sz w:val="18"/>
+        </w:rPr>
+        <w:t xml:space="preserve">  "result": "应用开发成本从几个月降到一个周末",</w:t>
+      </w:r>
+    </w:p>
+    <w:p>
+      <w:pPr>
+        <w:shd w:val="clear" w:fill="F2F2F2"/>
+        <w:spacing w:after="0"/>
+        <w:ind w:left="113"/>
+      </w:pPr>
+      <w:r>
+        <w:rPr>
+          <w:rFonts w:ascii="Consolas" w:hAnsi="Consolas" w:eastAsia="Consolas"/>
+          <w:sz w:val="18"/>
+        </w:rPr>
+        <w:t xml:space="preserve">  "completeness": "complete",</w:t>
+      </w:r>
+    </w:p>
+    <w:p>
+      <w:pPr>
+        <w:shd w:val="clear" w:fill="F2F2F2"/>
+        <w:spacing w:after="0"/>
+        <w:ind w:left="113"/>
+      </w:pPr>
+      <w:r>
+        <w:rPr>
+          <w:rFonts w:ascii="Consolas" w:hAnsi="Consolas" w:eastAsia="Consolas"/>
+          <w:sz w:val="18"/>
+        </w:rPr>
+        <w:t xml:space="preserve">  "evidence": "我的整个CEO工具栈里全是我自己构建的应用。"</w:t>
+      </w:r>
+    </w:p>
+    <w:p>
+      <w:pPr>
+        <w:shd w:val="clear" w:fill="F2F2F2"/>
+        <w:spacing w:after="120"/>
+        <w:ind w:left="113"/>
+      </w:pPr>
+      <w:r>
+        <w:rPr>
+          <w:rFonts w:ascii="Consolas" w:hAnsi="Consolas" w:eastAsia="Consolas"/>
+          <w:sz w:val="18"/>
+        </w:rPr>
+        <w:t>}</w:t>
+      </w:r>
+    </w:p>
+    <w:p>
+      <w:pPr>
+        <w:spacing w:after="120"/>
+      </w:pPr>
+      <w:r>
+        <w:rPr>
+          <w:rFonts w:ascii="微软雅黑" w:hAnsi="微软雅黑" w:eastAsia="微软雅黑"/>
+          <w:sz w:val="21"/>
+        </w:rPr>
+        <w:t>Prompt 要求至少 3 个观点带 case；泛泛举例（“比如很多公司都这样”）填 null。</w:t>
+      </w:r>
+    </w:p>
+    <w:p>
+      <w:pPr>
+        <w:spacing w:after="120"/>
+      </w:pPr>
+      <w:r>
+        <w:rPr>
+          <w:rFonts w:ascii="微软雅黑" w:hAnsi="微软雅黑" w:eastAsia="微软雅黑"/>
+          <w:b/>
+          <w:sz w:val="21"/>
+        </w:rPr>
+        <w:t>编辑价值</w:t>
+      </w:r>
+      <w:r>
+        <w:rPr>
+          <w:rFonts w:ascii="微软雅黑" w:hAnsi="微软雅黑" w:eastAsia="微软雅黑"/>
+          <w:sz w:val="21"/>
+        </w:rPr>
+        <w:t>：completeness 标注直接告诉编辑——这个案例能不能直接写进文章？三要素完整（complete）的案例可以直接用；要素不全（partial）的需要编辑补背景或结果，或降级为一句引述；unknown 的不建议作为案例展开。前端详情弹窗中，案例以“背景/行动/结果”三段式展示，完整性以彩色徽标标注（绿色=完整、琥珀=需补、灰=仅只言片语），方便编辑在选素材时直接识别可用案例。</w:t>
       </w:r>
     </w:p>
     <w:p>
@@ -5524,6 +6288,18 @@
         <w:t>八、关键节点的质量 Rubric 汇总</w:t>
       </w:r>
     </w:p>
+    <w:p>
+      <w:pPr>
+        <w:spacing w:after="120"/>
+      </w:pPr>
+      <w:r>
+        <w:rPr>
+          <w:rFonts w:ascii="微软雅黑" w:hAnsi="微软雅黑" w:eastAsia="微软雅黑"/>
+          <w:sz w:val="21"/>
+        </w:rPr>
+        <w:t>每个指标都有可执行的操作刻度：怎么打分、测什么、通过线在哪。编辑不需要凭感觉判断“好不好”。</w:t>
+      </w:r>
+    </w:p>
     <w:tbl>
       <w:tblPr>
         <w:tblStyle w:val="TableGrid"/>
@@ -5532,14 +6308,15 @@
         <w:tblLook w:firstColumn="1" w:firstRow="1" w:lastColumn="0" w:lastRow="0" w:noHBand="0" w:noVBand="1" w:val="04A0"/>
       </w:tblPr>
       <w:tblGrid>
-        <w:gridCol w:w="2880"/>
-        <w:gridCol w:w="2880"/>
-        <w:gridCol w:w="2880"/>
+        <w:gridCol w:w="2160"/>
+        <w:gridCol w:w="2160"/>
+        <w:gridCol w:w="2160"/>
+        <w:gridCol w:w="2160"/>
       </w:tblGrid>
       <w:tr>
         <w:tc>
           <w:tcPr>
-            <w:tcW w:type="dxa" w:w="1928"/>
+            <w:tcW w:type="dxa" w:w="1587"/>
             <w:shd w:val="clear" w:fill="1F3A5F"/>
           </w:tcPr>
           <w:p>
@@ -5556,7 +6333,7 @@
         </w:tc>
         <w:tc>
           <w:tcPr>
-            <w:tcW w:type="dxa" w:w="4082"/>
+            <w:tcW w:type="dxa" w:w="1928"/>
             <w:shd w:val="clear" w:fill="1F3A5F"/>
           </w:tcPr>
           <w:p>
@@ -5573,7 +6350,7 @@
         </w:tc>
         <w:tc>
           <w:tcPr>
-            <w:tcW w:type="dxa" w:w="3402"/>
+            <w:tcW w:type="dxa" w:w="3515"/>
             <w:shd w:val="clear" w:fill="1F3A5F"/>
           </w:tcPr>
           <w:p>
@@ -5584,7 +6361,24 @@
                 <w:color w:val="FFFFFF"/>
                 <w:sz w:val="19"/>
               </w:rPr>
-              <w:t>测量方式</w:t>
+              <w:t>操作刻度（怎么打分）</w:t>
+            </w:r>
+          </w:p>
+        </w:tc>
+        <w:tc>
+          <w:tcPr>
+            <w:tcW w:type="dxa" w:w="2381"/>
+            <w:shd w:val="clear" w:fill="1F3A5F"/>
+          </w:tcPr>
+          <w:p>
+            <w:r>
+              <w:rPr>
+                <w:rFonts w:ascii="微软雅黑" w:hAnsi="微软雅黑" w:eastAsia="微软雅黑"/>
+                <w:b/>
+                <w:color w:val="FFFFFF"/>
+                <w:sz w:val="19"/>
+              </w:rPr>
+              <w:t>通过标准</w:t>
             </w:r>
           </w:p>
         </w:tc>
@@ -5592,7 +6386,7 @@
       <w:tr>
         <w:tc>
           <w:tcPr>
-            <w:tcW w:type="dxa" w:w="1928"/>
+            <w:tcW w:type="dxa" w:w="1587"/>
           </w:tcPr>
           <w:p>
             <w:r>
@@ -5606,7 +6400,7 @@
         </w:tc>
         <w:tc>
           <w:tcPr>
-            <w:tcW w:type="dxa" w:w="4082"/>
+            <w:tcW w:type="dxa" w:w="1928"/>
           </w:tcPr>
           <w:p>
             <w:r>
@@ -5614,13 +6408,13 @@
                 <w:rFonts w:ascii="微软雅黑" w:hAnsi="微软雅黑" w:eastAsia="微软雅黑"/>
                 <w:sz w:val="19"/>
               </w:rPr>
-              <w:t>观点密度（每节点独立判断力）、证据覆盖（每条可溯源）、分类准确</w:t>
+              <w:t>观点密度、证据覆盖、分类准确</w:t>
             </w:r>
           </w:p>
         </w:tc>
         <w:tc>
           <w:tcPr>
-            <w:tcW w:type="dxa" w:w="3402"/>
+            <w:tcW w:type="dxa" w:w="3515"/>
           </w:tcPr>
           <w:p>
             <w:r>
@@ -5628,7 +6422,21 @@
                 <w:rFonts w:ascii="微软雅黑" w:hAnsi="微软雅黑" w:eastAsia="微软雅黑"/>
                 <w:sz w:val="19"/>
               </w:rPr>
-              <w:t>LLM-as-judge：另一个 LLM 独立检查每个节点是否能回原文、分类是否合理</w:t>
+              <w:t>LLM-as-judge 对每个节点打 1-5 分（能否回原文、分类是否合理）；随机抽 30% 节点反向定位原文；统计泛化句（“AI很重要”类）占比</w:t>
+            </w:r>
+          </w:p>
+        </w:tc>
+        <w:tc>
+          <w:tcPr>
+            <w:tcW w:type="dxa" w:w="2381"/>
+          </w:tcPr>
+          <w:p>
+            <w:r>
+              <w:rPr>
+                <w:rFonts w:ascii="微软雅黑" w:hAnsi="微软雅黑" w:eastAsia="微软雅黑"/>
+                <w:sz w:val="19"/>
+              </w:rPr>
+              <w:t>密度均分 ≥4；回源率 ≥90%；分类合理率 ≥80%；泛化句占比 &lt;10%</w:t>
             </w:r>
           </w:p>
         </w:tc>
@@ -5636,7 +6444,7 @@
       <w:tr>
         <w:tc>
           <w:tcPr>
-            <w:tcW w:type="dxa" w:w="1928"/>
+            <w:tcW w:type="dxa" w:w="1587"/>
             <w:shd w:val="clear" w:fill="EDF1F7"/>
           </w:tcPr>
           <w:p>
@@ -5651,7 +6459,7 @@
         </w:tc>
         <w:tc>
           <w:tcPr>
-            <w:tcW w:type="dxa" w:w="4082"/>
+            <w:tcW w:type="dxa" w:w="1928"/>
             <w:shd w:val="clear" w:fill="EDF1F7"/>
           </w:tcPr>
           <w:p>
@@ -5660,13 +6468,13 @@
                 <w:rFonts w:ascii="微软雅黑" w:hAnsi="微软雅黑" w:eastAsia="微软雅黑"/>
                 <w:sz w:val="19"/>
               </w:rPr>
-              <w:t>陷阱检测率（note_02 是否被正确识别）、时效判断准确率</w:t>
+              <w:t>陷阱检测、时效判断、可用性判定</w:t>
             </w:r>
           </w:p>
         </w:tc>
         <w:tc>
           <w:tcPr>
-            <w:tcW w:type="dxa" w:w="3402"/>
+            <w:tcW w:type="dxa" w:w="3515"/>
             <w:shd w:val="clear" w:fill="EDF1F7"/>
           </w:tcPr>
           <w:p>
@@ -5675,7 +6483,22 @@
                 <w:rFonts w:ascii="微软雅黑" w:hAnsi="微软雅黑" w:eastAsia="微软雅黑"/>
                 <w:sz w:val="19"/>
               </w:rPr>
-              <w:t>编辑人工审核</w:t>
+              <w:t>检查 note_02 是否标记“同一场/不复用”；检查 &gt;1 年笔记是否标“仅背景参考”；逐条检查判断理由是否具体</w:t>
+            </w:r>
+          </w:p>
+        </w:tc>
+        <w:tc>
+          <w:tcPr>
+            <w:tcW w:type="dxa" w:w="2381"/>
+            <w:shd w:val="clear" w:fill="EDF1F7"/>
+          </w:tcPr>
+          <w:p>
+            <w:r>
+              <w:rPr>
+                <w:rFonts w:ascii="微软雅黑" w:hAnsi="微软雅黑" w:eastAsia="微软雅黑"/>
+                <w:sz w:val="19"/>
+              </w:rPr>
+              <w:t>note_02 识别率 100%（漏检即不通过）；过时标注率 100%；理由为空条目 = 0</w:t>
             </w:r>
           </w:p>
         </w:tc>
@@ -5683,7 +6506,7 @@
       <w:tr>
         <w:tc>
           <w:tcPr>
-            <w:tcW w:type="dxa" w:w="1928"/>
+            <w:tcW w:type="dxa" w:w="1587"/>
           </w:tcPr>
           <w:p>
             <w:r>
@@ -5697,7 +6520,7 @@
         </w:tc>
         <w:tc>
           <w:tcPr>
-            <w:tcW w:type="dxa" w:w="4082"/>
+            <w:tcW w:type="dxa" w:w="1928"/>
           </w:tcPr>
           <w:p>
             <w:r>
@@ -5711,7 +6534,21 @@
         </w:tc>
         <w:tc>
           <w:tcPr>
-            <w:tcW w:type="dxa" w:w="3402"/>
+            <w:tcW w:type="dxa" w:w="3515"/>
+          </w:tcPr>
+          <w:p>
+            <w:r>
+              <w:rPr>
+                <w:rFonts w:ascii="微软雅黑" w:hAnsi="微软雅黑" w:eastAsia="微软雅黑"/>
+                <w:sz w:val="19"/>
+              </w:rPr>
+              <w:t>—</w:t>
+            </w:r>
+          </w:p>
+        </w:tc>
+        <w:tc>
+          <w:tcPr>
+            <w:tcW w:type="dxa" w:w="2381"/>
           </w:tcPr>
           <w:p>
             <w:r>
@@ -5727,7 +6564,7 @@
       <w:tr>
         <w:tc>
           <w:tcPr>
-            <w:tcW w:type="dxa" w:w="1928"/>
+            <w:tcW w:type="dxa" w:w="1587"/>
             <w:shd w:val="clear" w:fill="EDF1F7"/>
           </w:tcPr>
           <w:p>
@@ -5742,7 +6579,7 @@
         </w:tc>
         <w:tc>
           <w:tcPr>
-            <w:tcW w:type="dxa" w:w="4082"/>
+            <w:tcW w:type="dxa" w:w="1928"/>
             <w:shd w:val="clear" w:fill="EDF1F7"/>
           </w:tcPr>
           <w:p>
@@ -5751,13 +6588,13 @@
                 <w:rFonts w:ascii="微软雅黑" w:hAnsi="微软雅黑" w:eastAsia="微软雅黑"/>
                 <w:sz w:val="19"/>
               </w:rPr>
-              <w:t>风格一致性、证据保真、结构可用性</w:t>
+              <w:t>风格一致、证据保真、结构可用、判断保留</w:t>
             </w:r>
           </w:p>
         </w:tc>
         <w:tc>
           <w:tcPr>
-            <w:tcW w:type="dxa" w:w="3402"/>
+            <w:tcW w:type="dxa" w:w="3515"/>
             <w:shd w:val="clear" w:fill="EDF1F7"/>
           </w:tcPr>
           <w:p>
@@ -5766,7 +6603,22 @@
                 <w:rFonts w:ascii="微软雅黑" w:hAnsi="微软雅黑" w:eastAsia="微软雅黑"/>
                 <w:sz w:val="19"/>
               </w:rPr>
-              <w:t>编辑主观评分 + LLM 比对草稿 vs 观点节点的语义偏移量</w:t>
+              <w:t>编辑按 1-5 打风格分；随机抽 20% 论述反向定位到观点节点；统计“在当今时代”类 AI 味开头次数；核对是否有语气升级（“也许”改“一定”）</w:t>
+            </w:r>
+          </w:p>
+        </w:tc>
+        <w:tc>
+          <w:tcPr>
+            <w:tcW w:type="dxa" w:w="2381"/>
+            <w:shd w:val="clear" w:fill="EDF1F7"/>
+          </w:tcPr>
+          <w:p>
+            <w:r>
+              <w:rPr>
+                <w:rFonts w:ascii="微软雅黑" w:hAnsi="微软雅黑" w:eastAsia="微软雅黑"/>
+                <w:sz w:val="19"/>
+              </w:rPr>
+              <w:t>风格 ≥4 分；定位率 100%；AI 味开头 ≤1 次；语气升级 = 不通过；结构 10 分钟可改</w:t>
             </w:r>
           </w:p>
         </w:tc>
@@ -5774,7 +6626,7 @@
       <w:tr>
         <w:tc>
           <w:tcPr>
-            <w:tcW w:type="dxa" w:w="1928"/>
+            <w:tcW w:type="dxa" w:w="1587"/>
           </w:tcPr>
           <w:p>
             <w:r>
@@ -5788,7 +6640,7 @@
         </w:tc>
         <w:tc>
           <w:tcPr>
-            <w:tcW w:type="dxa" w:w="4082"/>
+            <w:tcW w:type="dxa" w:w="1928"/>
           </w:tcPr>
           <w:p>
             <w:r>
@@ -5796,13 +6648,13 @@
                 <w:rFonts w:ascii="微软雅黑" w:hAnsi="微软雅黑" w:eastAsia="微软雅黑"/>
                 <w:sz w:val="19"/>
               </w:rPr>
-              <w:t>内检覆盖率、误报率、外检溯源完整性</w:t>
+              <w:t>内检覆盖率、误报率、外检溯源、可操作性</w:t>
             </w:r>
           </w:p>
         </w:tc>
         <w:tc>
           <w:tcPr>
-            <w:tcW w:type="dxa" w:w="3402"/>
+            <w:tcW w:type="dxa" w:w="3515"/>
           </w:tcPr>
           <w:p>
             <w:r>
@@ -5810,7 +6662,21 @@
                 <w:rFonts w:ascii="微软雅黑" w:hAnsi="微软雅黑" w:eastAsia="微软雅黑"/>
                 <w:sz w:val="19"/>
               </w:rPr>
-              <w:t>编辑审核标注是否准确</w:t>
+              <w:t>统计带时间戳论述的比对率；编辑复核标注后统计“狼来了”占比；检查每条外检结论是否有来源链接；检查每条标注是否有“建议动作”</w:t>
+            </w:r>
+          </w:p>
+        </w:tc>
+        <w:tc>
+          <w:tcPr>
+            <w:tcW w:type="dxa" w:w="2381"/>
+          </w:tcPr>
+          <w:p>
+            <w:r>
+              <w:rPr>
+                <w:rFonts w:ascii="微软雅黑" w:hAnsi="微软雅黑" w:eastAsia="微软雅黑"/>
+                <w:sz w:val="19"/>
+              </w:rPr>
+              <w:t>覆盖率 100%；误报率 &lt;20%；无链接 = 不通过；缺建议动作 = 不通过</w:t>
             </w:r>
           </w:p>
         </w:tc>
@@ -5818,7 +6684,7 @@
       <w:tr>
         <w:tc>
           <w:tcPr>
-            <w:tcW w:type="dxa" w:w="1928"/>
+            <w:tcW w:type="dxa" w:w="1587"/>
             <w:shd w:val="clear" w:fill="EDF1F7"/>
           </w:tcPr>
           <w:p>
@@ -5833,7 +6699,7 @@
         </w:tc>
         <w:tc>
           <w:tcPr>
-            <w:tcW w:type="dxa" w:w="4082"/>
+            <w:tcW w:type="dxa" w:w="1928"/>
             <w:shd w:val="clear" w:fill="EDF1F7"/>
           </w:tcPr>
           <w:p>
@@ -5842,13 +6708,13 @@
                 <w:rFonts w:ascii="微软雅黑" w:hAnsi="微软雅黑" w:eastAsia="微软雅黑"/>
                 <w:sz w:val="19"/>
               </w:rPr>
-              <w:t>观点密度、目标读者匹配度、证据可溯源</w:t>
+              <w:t>观点密度、读者匹配、证据可溯源</w:t>
             </w:r>
           </w:p>
         </w:tc>
         <w:tc>
           <w:tcPr>
-            <w:tcW w:type="dxa" w:w="3402"/>
+            <w:tcW w:type="dxa" w:w="3515"/>
             <w:shd w:val="clear" w:fill="EDF1F7"/>
           </w:tcPr>
           <w:p>
@@ -5857,7 +6723,22 @@
                 <w:rFonts w:ascii="微软雅黑" w:hAnsi="微软雅黑" w:eastAsia="微软雅黑"/>
                 <w:sz w:val="19"/>
               </w:rPr>
-              <w:t>编辑终审 + 读者反馈</w:t>
+              <w:t>编辑终审 + 读者抽读反馈</w:t>
+            </w:r>
+          </w:p>
+        </w:tc>
+        <w:tc>
+          <w:tcPr>
+            <w:tcW w:type="dxa" w:w="2381"/>
+            <w:shd w:val="clear" w:fill="EDF1F7"/>
+          </w:tcPr>
+          <w:p>
+            <w:r>
+              <w:rPr>
+                <w:rFonts w:ascii="微软雅黑" w:hAnsi="微软雅黑" w:eastAsia="微软雅黑"/>
+                <w:sz w:val="19"/>
+              </w:rPr>
+              <w:t>编辑通过 + 读者能追溯关键结论到原文（抽读可溯源率 ≥90%）</w:t>
             </w:r>
           </w:p>
         </w:tc>

</xml_diff>

<commit_message>
fix: restore solution_design.docx to pre-review-edit version
The AI-added sections (relations, case modeling) in the docx described
features that were removed from the Agent 1 prompt after they degraded
DeepSeek's output quality. Restoring the original version that matches
what the code actually does.

Co-Authored-By: Claude Opus 4.7 (1M context) <noreply@anthropic.com>
</commit_message>
<xml_diff>
--- a/docs/solution_design.docx
+++ b/docs/solution_design.docx
@@ -827,770 +827,6 @@
           <w:sz w:val="18"/>
         </w:rPr>
         <w:t>}</w:t>
-      </w:r>
-    </w:p>
-    <w:p>
-      <w:pPr>
-        <w:pStyle w:val="Heading2"/>
-        <w:spacing w:before="200" w:after="80"/>
-      </w:pPr>
-      <w:r>
-        <w:rPr>
-          <w:rFonts w:ascii="微软雅黑" w:hAnsi="微软雅黑" w:eastAsia="微软雅黑"/>
-          <w:b/>
-          <w:color w:val="1F3A5F"/>
-          <w:sz w:val="26"/>
-        </w:rPr>
-        <w:t>因果链建模（causalChain）</w:t>
-      </w:r>
-    </w:p>
-    <w:p>
-      <w:pPr>
-        <w:spacing w:after="120"/>
-      </w:pPr>
-      <w:r>
-        <w:rPr>
-          <w:rFonts w:ascii="微软雅黑" w:hAnsi="微软雅黑" w:eastAsia="微软雅黑"/>
-          <w:sz w:val="21"/>
-        </w:rPr>
-        <w:t>嘉宾观点的价值往往藏在论证过程里，而不是结论本身。Agent 1 在提取观点时同步提取因果链，让编辑一眼看到“前提 → 推理 → 结论”的论证骨架，而不是被口语化的跳跃表达淹没。</w:t>
-      </w:r>
-    </w:p>
-    <w:p>
-      <w:pPr>
-        <w:spacing w:after="120"/>
-      </w:pPr>
-      <w:r>
-        <w:rPr>
-          <w:rFonts w:ascii="微软雅黑" w:hAnsi="微软雅黑" w:eastAsia="微软雅黑"/>
-          <w:b/>
-          <w:sz w:val="21"/>
-        </w:rPr>
-        <w:t>提取判断标准</w:t>
-      </w:r>
-      <w:r>
-        <w:rPr>
-          <w:rFonts w:ascii="微软雅黑" w:hAnsi="微软雅黑" w:eastAsia="微软雅黑"/>
-          <w:sz w:val="21"/>
-        </w:rPr>
-        <w:t>（只有包含因果推理才提取；纯事实陈述或纯行动建议填 null）：</w:t>
-      </w:r>
-    </w:p>
-    <w:p>
-      <w:pPr>
-        <w:pStyle w:val="ListBullet"/>
-        <w:spacing w:after="40"/>
-      </w:pPr>
-      <w:r>
-        <w:rPr>
-          <w:rFonts w:ascii="微软雅黑" w:hAnsi="微软雅黑" w:eastAsia="微软雅黑"/>
-          <w:sz w:val="21"/>
-        </w:rPr>
-        <w:t>嘉宾说“因为X，所以Y” → 有因果</w:t>
-      </w:r>
-    </w:p>
-    <w:p>
-      <w:pPr>
-        <w:pStyle w:val="ListBullet"/>
-        <w:spacing w:after="40"/>
-      </w:pPr>
-      <w:r>
-        <w:rPr>
-          <w:rFonts w:ascii="微软雅黑" w:hAnsi="微软雅黑" w:eastAsia="微软雅黑"/>
-          <w:sz w:val="21"/>
-        </w:rPr>
-        <w:t>嘉宾说“如果不X，就会Y” → 有因果</w:t>
-      </w:r>
-    </w:p>
-    <w:p>
-      <w:pPr>
-        <w:pStyle w:val="ListBullet"/>
-        <w:spacing w:after="40"/>
-      </w:pPr>
-      <w:r>
-        <w:rPr>
-          <w:rFonts w:ascii="微软雅黑" w:hAnsi="微软雅黑" w:eastAsia="微软雅黑"/>
-          <w:sz w:val="21"/>
-        </w:rPr>
-        <w:t>嘉宾说“X导致了Y，所以我们需要Z” → 有因果</w:t>
-      </w:r>
-    </w:p>
-    <w:p>
-      <w:pPr>
-        <w:pStyle w:val="ListBullet"/>
-        <w:spacing w:after="40"/>
-      </w:pPr>
-      <w:r>
-        <w:rPr>
-          <w:rFonts w:ascii="微软雅黑" w:hAnsi="微软雅黑" w:eastAsia="微软雅黑"/>
-          <w:sz w:val="21"/>
-        </w:rPr>
-        <w:t>嘉宾说“以前是A，现在是B，这意味着C” → 有因果</w:t>
-      </w:r>
-    </w:p>
-    <w:p>
-      <w:pPr>
-        <w:pStyle w:val="ListBullet"/>
-        <w:spacing w:after="40"/>
-      </w:pPr>
-      <w:r>
-        <w:rPr>
-          <w:rFonts w:ascii="微软雅黑" w:hAnsi="微软雅黑" w:eastAsia="微软雅黑"/>
-          <w:sz w:val="21"/>
-        </w:rPr>
-        <w:t>嘉宾只是描述事实“X公司做了Y产品” → 无因果，填 null</w:t>
-      </w:r>
-    </w:p>
-    <w:p>
-      <w:pPr>
-        <w:pStyle w:val="ListBullet"/>
-        <w:spacing w:after="40"/>
-      </w:pPr>
-      <w:r>
-        <w:rPr>
-          <w:rFonts w:ascii="微软雅黑" w:hAnsi="微软雅黑" w:eastAsia="微软雅黑"/>
-          <w:sz w:val="21"/>
-        </w:rPr>
-        <w:t>嘉宾只是给建议“你应该去试试Z” → 无因果，填 null</w:t>
-      </w:r>
-    </w:p>
-    <w:p>
-      <w:pPr>
-        <w:spacing w:after="120"/>
-      </w:pPr>
-      <w:r>
-        <w:rPr>
-          <w:rFonts w:ascii="微软雅黑" w:hAnsi="微软雅黑" w:eastAsia="微软雅黑"/>
-          <w:b/>
-          <w:sz w:val="21"/>
-        </w:rPr>
-        <w:t>结构</w:t>
-      </w:r>
-      <w:r>
-        <w:rPr>
-          <w:rFonts w:ascii="微软雅黑" w:hAnsi="微软雅黑" w:eastAsia="微软雅黑"/>
-          <w:sz w:val="21"/>
-        </w:rPr>
-        <w:t>：</w:t>
-      </w:r>
-    </w:p>
-    <w:p>
-      <w:pPr>
-        <w:shd w:val="clear" w:fill="F2F2F2"/>
-        <w:spacing w:after="0"/>
-        <w:ind w:left="113"/>
-      </w:pPr>
-      <w:r>
-        <w:rPr>
-          <w:rFonts w:ascii="Consolas" w:hAnsi="Consolas" w:eastAsia="Consolas"/>
-          <w:sz w:val="18"/>
-        </w:rPr>
-        <w:t>{</w:t>
-      </w:r>
-    </w:p>
-    <w:p>
-      <w:pPr>
-        <w:shd w:val="clear" w:fill="F2F2F2"/>
-        <w:spacing w:after="0"/>
-        <w:ind w:left="113"/>
-      </w:pPr>
-      <w:r>
-        <w:rPr>
-          <w:rFonts w:ascii="Consolas" w:hAnsi="Consolas" w:eastAsia="Consolas"/>
-          <w:sz w:val="18"/>
-        </w:rPr>
-        <w:t xml:space="preserve">  "premise": "前提",</w:t>
-      </w:r>
-    </w:p>
-    <w:p>
-      <w:pPr>
-        <w:shd w:val="clear" w:fill="F2F2F2"/>
-        <w:spacing w:after="0"/>
-        <w:ind w:left="113"/>
-      </w:pPr>
-      <w:r>
-        <w:rPr>
-          <w:rFonts w:ascii="Consolas" w:hAnsi="Consolas" w:eastAsia="Consolas"/>
-          <w:sz w:val="18"/>
-        </w:rPr>
-        <w:t xml:space="preserve">  "reasoning": "推理过程",</w:t>
-      </w:r>
-    </w:p>
-    <w:p>
-      <w:pPr>
-        <w:shd w:val="clear" w:fill="F2F2F2"/>
-        <w:spacing w:after="0"/>
-        <w:ind w:left="113"/>
-      </w:pPr>
-      <w:r>
-        <w:rPr>
-          <w:rFonts w:ascii="Consolas" w:hAnsi="Consolas" w:eastAsia="Consolas"/>
-          <w:sz w:val="18"/>
-        </w:rPr>
-        <w:t xml:space="preserve">  "conclusion": "结论",</w:t>
-      </w:r>
-    </w:p>
-    <w:p>
-      <w:pPr>
-        <w:shd w:val="clear" w:fill="F2F2F2"/>
-        <w:spacing w:after="0"/>
-        <w:ind w:left="113"/>
-      </w:pPr>
-      <w:r>
-        <w:rPr>
-          <w:rFonts w:ascii="Consolas" w:hAnsi="Consolas" w:eastAsia="Consolas"/>
-          <w:sz w:val="18"/>
-        </w:rPr>
-        <w:t xml:space="preserve">  "evidence": [{ "segment": "说话人 时间戳", "text": "支撑因果链的原文" }],</w:t>
-      </w:r>
-    </w:p>
-    <w:p>
-      <w:pPr>
-        <w:shd w:val="clear" w:fill="F2F2F2"/>
-        <w:spacing w:after="0"/>
-        <w:ind w:left="113"/>
-      </w:pPr>
-      <w:r>
-        <w:rPr>
-          <w:rFonts w:ascii="Consolas" w:hAnsi="Consolas" w:eastAsia="Consolas"/>
-          <w:sz w:val="18"/>
-        </w:rPr>
-        <w:t xml:space="preserve">  "missingSteps": ["这个因果链还缺什么？编辑应该注意什么逻辑断点？"]</w:t>
-      </w:r>
-    </w:p>
-    <w:p>
-      <w:pPr>
-        <w:shd w:val="clear" w:fill="F2F2F2"/>
-        <w:spacing w:after="120"/>
-        <w:ind w:left="113"/>
-      </w:pPr>
-      <w:r>
-        <w:rPr>
-          <w:rFonts w:ascii="Consolas" w:hAnsi="Consolas" w:eastAsia="Consolas"/>
-          <w:sz w:val="18"/>
-        </w:rPr>
-        <w:t>}</w:t>
-      </w:r>
-    </w:p>
-    <w:p>
-      <w:pPr>
-        <w:spacing w:after="120"/>
-      </w:pPr>
-      <w:r>
-        <w:rPr>
-          <w:rFonts w:ascii="微软雅黑" w:hAnsi="微软雅黑" w:eastAsia="微软雅黑"/>
-          <w:sz w:val="21"/>
-        </w:rPr>
-        <w:t>Prompt 要求至少 5 个观点带 causalChain——大多数嘉宾观点都包含因果推理。</w:t>
-      </w:r>
-    </w:p>
-    <w:p>
-      <w:pPr>
-        <w:spacing w:after="120"/>
-      </w:pPr>
-      <w:r>
-        <w:rPr>
-          <w:rFonts w:ascii="微软雅黑" w:hAnsi="微软雅黑" w:eastAsia="微软雅黑"/>
-          <w:b/>
-          <w:sz w:val="21"/>
-        </w:rPr>
-        <w:t>前端呈现与编辑价值</w:t>
-      </w:r>
-      <w:r>
-        <w:rPr>
-          <w:rFonts w:ascii="微软雅黑" w:hAnsi="微软雅黑" w:eastAsia="微软雅黑"/>
-          <w:sz w:val="21"/>
-        </w:rPr>
-        <w:t>：观点详情弹窗中，因果链以蓝色递进箭头展示“前提 → 推理 → 结论”，每条链附证据原文；</w:t>
-      </w:r>
-      <w:r>
-        <w:rPr>
-          <w:rFonts w:ascii="微软雅黑" w:hAnsi="微软雅黑" w:eastAsia="微软雅黑"/>
-          <w:sz w:val="21"/>
-        </w:rPr>
-        <w:t>missingSteps</w:t>
-      </w:r>
-      <w:r>
-        <w:rPr>
-          <w:rFonts w:ascii="微软雅黑" w:hAnsi="微软雅黑" w:eastAsia="微软雅黑"/>
-          <w:sz w:val="21"/>
-        </w:rPr>
-        <w:t xml:space="preserve"> 以琥珀色“推理链断点”警示。这正面回应了题目强调的痛点——“AI 容易遗漏关键因果、把嘉宾的口语表达写得过满”：因果链让编辑直接看到论证的完整性与断点，决定是否补足或删减，而不是让 AI 在生成时自行脑补缺失环节。</w:t>
-      </w:r>
-    </w:p>
-    <w:p>
-      <w:pPr>
-        <w:pStyle w:val="Heading2"/>
-        <w:spacing w:before="200" w:after="80"/>
-      </w:pPr>
-      <w:r>
-        <w:rPr>
-          <w:rFonts w:ascii="微软雅黑" w:hAnsi="微软雅黑" w:eastAsia="微软雅黑"/>
-          <w:b/>
-          <w:color w:val="1F3A5F"/>
-          <w:sz w:val="26"/>
-        </w:rPr>
-        <w:t>观点间关系建模（relations，逻辑链）</w:t>
-      </w:r>
-    </w:p>
-    <w:p>
-      <w:pPr>
-        <w:spacing w:after="120"/>
-      </w:pPr>
-      <w:r>
-        <w:rPr>
-          <w:rFonts w:ascii="微软雅黑" w:hAnsi="微软雅黑" w:eastAsia="微软雅黑"/>
-          <w:sz w:val="21"/>
-        </w:rPr>
-        <w:t>因果链解决“一个观点内部的论证”，relations 解决</w:t>
-      </w:r>
-      <w:r>
-        <w:rPr>
-          <w:rFonts w:ascii="微软雅黑" w:hAnsi="微软雅黑" w:eastAsia="微软雅黑"/>
-          <w:b/>
-          <w:sz w:val="21"/>
-        </w:rPr>
-        <w:t>观点与观点之间的逻辑关系</w:t>
-      </w:r>
-      <w:r>
-        <w:rPr>
-          <w:rFonts w:ascii="微软雅黑" w:hAnsi="微软雅黑" w:eastAsia="微软雅黑"/>
-          <w:sz w:val="21"/>
-        </w:rPr>
-        <w:t>。Agent 1 提取完观点后，为有明确逻辑关系的观点对添加 relations，把扁平的 JSON 列表变成可追溯的逻辑链：</w:t>
-      </w:r>
-    </w:p>
-    <w:p>
-      <w:pPr>
-        <w:pStyle w:val="ListBullet"/>
-        <w:spacing w:after="40"/>
-      </w:pPr>
-      <w:r>
-        <w:rPr>
-          <w:rFonts w:ascii="微软雅黑" w:hAnsi="微软雅黑" w:eastAsia="微软雅黑"/>
-          <w:b/>
-          <w:sz w:val="21"/>
-        </w:rPr>
-        <w:t>causal（因果）</w:t>
-      </w:r>
-      <w:r>
-        <w:rPr>
-          <w:rFonts w:ascii="微软雅黑" w:hAnsi="微软雅黑" w:eastAsia="微软雅黑"/>
-          <w:sz w:val="21"/>
-        </w:rPr>
-        <w:t>：vp_A 是 vp_B 的前提/原因——“因为A，所以B”跨观点的推导</w:t>
-      </w:r>
-    </w:p>
-    <w:p>
-      <w:pPr>
-        <w:pStyle w:val="ListBullet"/>
-        <w:spacing w:after="40"/>
-      </w:pPr>
-      <w:r>
-        <w:rPr>
-          <w:rFonts w:ascii="微软雅黑" w:hAnsi="微软雅黑" w:eastAsia="微软雅黑"/>
-          <w:b/>
-          <w:sz w:val="21"/>
-        </w:rPr>
-        <w:t>progressive（递进）</w:t>
-      </w:r>
-      <w:r>
-        <w:rPr>
-          <w:rFonts w:ascii="微软雅黑" w:hAnsi="微软雅黑" w:eastAsia="微软雅黑"/>
-          <w:sz w:val="21"/>
-        </w:rPr>
-        <w:t>：vp_B 是 vp_A 的深化/延伸——先讲现象，再讲机制，再讲怎么办</w:t>
-      </w:r>
-    </w:p>
-    <w:p>
-      <w:pPr>
-        <w:pStyle w:val="ListBullet"/>
-        <w:spacing w:after="40"/>
-      </w:pPr>
-      <w:r>
-        <w:rPr>
-          <w:rFonts w:ascii="微软雅黑" w:hAnsi="微软雅黑" w:eastAsia="微软雅黑"/>
-          <w:b/>
-          <w:sz w:val="21"/>
-        </w:rPr>
-        <w:t>contrast（对比）</w:t>
-      </w:r>
-      <w:r>
-        <w:rPr>
-          <w:rFonts w:ascii="微软雅黑" w:hAnsi="微软雅黑" w:eastAsia="微软雅黑"/>
-          <w:sz w:val="21"/>
-        </w:rPr>
-        <w:t>：vp_B 与 vp_A 构成对立或张力——两位嘉宾观点冲突，或同一嘉宾的“反常识”对照</w:t>
-      </w:r>
-    </w:p>
-    <w:p>
-      <w:pPr>
-        <w:spacing w:after="120"/>
-      </w:pPr>
-      <w:r>
-        <w:rPr>
-          <w:rFonts w:ascii="微软雅黑" w:hAnsi="微软雅黑" w:eastAsia="微软雅黑"/>
-          <w:b/>
-          <w:sz w:val="21"/>
-        </w:rPr>
-        <w:t>结构</w:t>
-      </w:r>
-      <w:r>
-        <w:rPr>
-          <w:rFonts w:ascii="微软雅黑" w:hAnsi="微软雅黑" w:eastAsia="微软雅黑"/>
-          <w:sz w:val="21"/>
-        </w:rPr>
-        <w:t>（每个观点节点的 relations 字段）：</w:t>
-      </w:r>
-    </w:p>
-    <w:p>
-      <w:pPr>
-        <w:shd w:val="clear" w:fill="F2F2F2"/>
-        <w:spacing w:after="0"/>
-        <w:ind w:left="113"/>
-      </w:pPr>
-      <w:r>
-        <w:rPr>
-          <w:rFonts w:ascii="Consolas" w:hAnsi="Consolas" w:eastAsia="Consolas"/>
-          <w:sz w:val="18"/>
-        </w:rPr>
-        <w:t>"relations": [</w:t>
-      </w:r>
-    </w:p>
-    <w:p>
-      <w:pPr>
-        <w:shd w:val="clear" w:fill="F2F2F2"/>
-        <w:spacing w:after="0"/>
-        <w:ind w:left="113"/>
-      </w:pPr>
-      <w:r>
-        <w:rPr>
-          <w:rFonts w:ascii="Consolas" w:hAnsi="Consolas" w:eastAsia="Consolas"/>
-          <w:sz w:val="18"/>
-        </w:rPr>
-        <w:t xml:space="preserve">  { "targetId": "vp_12", "type": "causal", "reason": "工业革命从未自动化劳动而是改变技能结构——这正是今天不适应新技术者收入下降的历史原因" }</w:t>
-      </w:r>
-    </w:p>
-    <w:p>
-      <w:pPr>
-        <w:shd w:val="clear" w:fill="F2F2F2"/>
-        <w:spacing w:after="120"/>
-        <w:ind w:left="113"/>
-      </w:pPr>
-      <w:r>
-        <w:rPr>
-          <w:rFonts w:ascii="Consolas" w:hAnsi="Consolas" w:eastAsia="Consolas"/>
-          <w:sz w:val="18"/>
-        </w:rPr>
-        <w:t>]</w:t>
-      </w:r>
-    </w:p>
-    <w:p>
-      <w:pPr>
-        <w:spacing w:after="120"/>
-      </w:pPr>
-      <w:r>
-        <w:rPr>
-          <w:rFonts w:ascii="微软雅黑" w:hAnsi="微软雅黑" w:eastAsia="微软雅黑"/>
-          <w:sz w:val="21"/>
-        </w:rPr>
-        <w:t>Prompt 要求至少 3 对关系，只标注逐字稿中明确可判断的关系，不硬凑。</w:t>
-      </w:r>
-    </w:p>
-    <w:p>
-      <w:pPr>
-        <w:spacing w:after="120"/>
-      </w:pPr>
-      <w:r>
-        <w:rPr>
-          <w:rFonts w:ascii="微软雅黑" w:hAnsi="微软雅黑" w:eastAsia="微软雅黑"/>
-          <w:b/>
-          <w:sz w:val="21"/>
-        </w:rPr>
-        <w:t>编辑价值</w:t>
-      </w:r>
-      <w:r>
-        <w:rPr>
-          <w:rFonts w:ascii="微软雅黑" w:hAnsi="微软雅黑" w:eastAsia="微软雅黑"/>
-          <w:sz w:val="21"/>
-        </w:rPr>
-        <w:t>：文章结构不能是观点的随意堆叠。relations 让编辑一眼看到哪些观点是“前提”、哪些是“结论”、哪些构成张力——搭结构时自然形成递进或对比，而不是平铺。Agent 3 生成初稿时也会据此把有因果关系的观点组织进同一段落，避免“观点之间没有逻辑勾连”的 AI 味。</w:t>
-      </w:r>
-    </w:p>
-    <w:p>
-      <w:pPr>
-        <w:pStyle w:val="Heading2"/>
-        <w:spacing w:before="200" w:after="80"/>
-      </w:pPr>
-      <w:r>
-        <w:rPr>
-          <w:rFonts w:ascii="微软雅黑" w:hAnsi="微软雅黑" w:eastAsia="微软雅黑"/>
-          <w:b/>
-          <w:color w:val="1F3A5F"/>
-          <w:sz w:val="26"/>
-        </w:rPr>
-        <w:t>案例独立建模（case）</w:t>
-      </w:r>
-    </w:p>
-    <w:p>
-      <w:pPr>
-        <w:spacing w:after="120"/>
-      </w:pPr>
-      <w:r>
-        <w:rPr>
-          <w:rFonts w:ascii="微软雅黑" w:hAnsi="微软雅黑" w:eastAsia="微软雅黑"/>
-          <w:sz w:val="21"/>
-        </w:rPr>
-        <w:t>商业内容最有说服力的部分是案例，但案例不能只当“证据引用”用。Agent 1 识别嘉宾提到的具体案例（公司实践、个人经历、行业事件），</w:t>
-      </w:r>
-      <w:r>
-        <w:rPr>
-          <w:rFonts w:ascii="微软雅黑" w:hAnsi="微软雅黑" w:eastAsia="微软雅黑"/>
-          <w:b/>
-          <w:sz w:val="21"/>
-        </w:rPr>
-        <w:t>单独建模并标注完整性</w:t>
-      </w:r>
-      <w:r>
-        <w:rPr>
-          <w:rFonts w:ascii="微软雅黑" w:hAnsi="微软雅黑" w:eastAsia="微软雅黑"/>
-          <w:sz w:val="21"/>
-        </w:rPr>
-        <w:t>：</w:t>
-      </w:r>
-    </w:p>
-    <w:p>
-      <w:pPr>
-        <w:pStyle w:val="ListBullet"/>
-        <w:spacing w:after="40"/>
-      </w:pPr>
-      <w:r>
-        <w:rPr>
-          <w:rFonts w:ascii="微软雅黑" w:hAnsi="微软雅黑" w:eastAsia="微软雅黑"/>
-          <w:b/>
-          <w:sz w:val="21"/>
-        </w:rPr>
-        <w:t>background</w:t>
-      </w:r>
-      <w:r>
-        <w:rPr>
-          <w:rFonts w:ascii="微软雅黑" w:hAnsi="微软雅黑" w:eastAsia="微软雅黑"/>
-          <w:sz w:val="21"/>
-        </w:rPr>
-        <w:t>：背景（当事人是谁、什么处境）</w:t>
-      </w:r>
-    </w:p>
-    <w:p>
-      <w:pPr>
-        <w:pStyle w:val="ListBullet"/>
-        <w:spacing w:after="40"/>
-      </w:pPr>
-      <w:r>
-        <w:rPr>
-          <w:rFonts w:ascii="微软雅黑" w:hAnsi="微软雅黑" w:eastAsia="微软雅黑"/>
-          <w:b/>
-          <w:sz w:val="21"/>
-        </w:rPr>
-        <w:t>action</w:t>
-      </w:r>
-      <w:r>
-        <w:rPr>
-          <w:rFonts w:ascii="微软雅黑" w:hAnsi="微软雅黑" w:eastAsia="微软雅黑"/>
-          <w:sz w:val="21"/>
-        </w:rPr>
-        <w:t>：行动（做了什么）</w:t>
-      </w:r>
-    </w:p>
-    <w:p>
-      <w:pPr>
-        <w:pStyle w:val="ListBullet"/>
-        <w:spacing w:after="40"/>
-      </w:pPr>
-      <w:r>
-        <w:rPr>
-          <w:rFonts w:ascii="微软雅黑" w:hAnsi="微软雅黑" w:eastAsia="微软雅黑"/>
-          <w:b/>
-          <w:sz w:val="21"/>
-        </w:rPr>
-        <w:t>result</w:t>
-      </w:r>
-      <w:r>
-        <w:rPr>
-          <w:rFonts w:ascii="微软雅黑" w:hAnsi="微软雅黑" w:eastAsia="微软雅黑"/>
-          <w:sz w:val="21"/>
-        </w:rPr>
-        <w:t>：结果（带来了什么变化）</w:t>
-      </w:r>
-    </w:p>
-    <w:p>
-      <w:pPr>
-        <w:pStyle w:val="ListBullet"/>
-        <w:spacing w:after="40"/>
-      </w:pPr>
-      <w:r>
-        <w:rPr>
-          <w:rFonts w:ascii="微软雅黑" w:hAnsi="微软雅黑" w:eastAsia="微软雅黑"/>
-          <w:b/>
-          <w:sz w:val="21"/>
-        </w:rPr>
-        <w:t>completeness</w:t>
-      </w:r>
-      <w:r>
-        <w:rPr>
-          <w:rFonts w:ascii="微软雅黑" w:hAnsi="微软雅黑" w:eastAsia="微软雅黑"/>
-          <w:sz w:val="21"/>
-        </w:rPr>
-        <w:t>：三要素齐全=complete；缺一个=partial；只言片语无法成案=unknown</w:t>
-      </w:r>
-    </w:p>
-    <w:p>
-      <w:pPr>
-        <w:spacing w:after="120"/>
-      </w:pPr>
-      <w:r>
-        <w:rPr>
-          <w:rFonts w:ascii="微软雅黑" w:hAnsi="微软雅黑" w:eastAsia="微软雅黑"/>
-          <w:b/>
-          <w:sz w:val="21"/>
-        </w:rPr>
-        <w:t>结构</w:t>
-      </w:r>
-      <w:r>
-        <w:rPr>
-          <w:rFonts w:ascii="微软雅黑" w:hAnsi="微软雅黑" w:eastAsia="微软雅黑"/>
-          <w:sz w:val="21"/>
-        </w:rPr>
-        <w:t>（每个观点节点的 case 字段）：</w:t>
-      </w:r>
-    </w:p>
-    <w:p>
-      <w:pPr>
-        <w:shd w:val="clear" w:fill="F2F2F2"/>
-        <w:spacing w:after="0"/>
-        <w:ind w:left="113"/>
-      </w:pPr>
-      <w:r>
-        <w:rPr>
-          <w:rFonts w:ascii="Consolas" w:hAnsi="Consolas" w:eastAsia="Consolas"/>
-          <w:sz w:val="18"/>
-        </w:rPr>
-        <w:t>"case": {</w:t>
-      </w:r>
-    </w:p>
-    <w:p>
-      <w:pPr>
-        <w:shd w:val="clear" w:fill="F2F2F2"/>
-        <w:spacing w:after="0"/>
-        <w:ind w:left="113"/>
-      </w:pPr>
-      <w:r>
-        <w:rPr>
-          <w:rFonts w:ascii="Consolas" w:hAnsi="Consolas" w:eastAsia="Consolas"/>
-          <w:sz w:val="18"/>
-        </w:rPr>
-        <w:t xml:space="preserve">  "background": "嘉宾B是一位CEO，管理整个公司但坚持亲自动手",</w:t>
-      </w:r>
-    </w:p>
-    <w:p>
-      <w:pPr>
-        <w:shd w:val="clear" w:fill="F2F2F2"/>
-        <w:spacing w:after="0"/>
-        <w:ind w:left="113"/>
-      </w:pPr>
-      <w:r>
-        <w:rPr>
-          <w:rFonts w:ascii="Consolas" w:hAnsi="Consolas" w:eastAsia="Consolas"/>
-          <w:sz w:val="18"/>
-        </w:rPr>
-        <w:t xml:space="preserve">  "action": "用AI编程工具自建了整套CEO工具栈",</w:t>
-      </w:r>
-    </w:p>
-    <w:p>
-      <w:pPr>
-        <w:shd w:val="clear" w:fill="F2F2F2"/>
-        <w:spacing w:after="0"/>
-        <w:ind w:left="113"/>
-      </w:pPr>
-      <w:r>
-        <w:rPr>
-          <w:rFonts w:ascii="Consolas" w:hAnsi="Consolas" w:eastAsia="Consolas"/>
-          <w:sz w:val="18"/>
-        </w:rPr>
-        <w:t xml:space="preserve">  "result": "应用开发成本从几个月降到一个周末",</w:t>
-      </w:r>
-    </w:p>
-    <w:p>
-      <w:pPr>
-        <w:shd w:val="clear" w:fill="F2F2F2"/>
-        <w:spacing w:after="0"/>
-        <w:ind w:left="113"/>
-      </w:pPr>
-      <w:r>
-        <w:rPr>
-          <w:rFonts w:ascii="Consolas" w:hAnsi="Consolas" w:eastAsia="Consolas"/>
-          <w:sz w:val="18"/>
-        </w:rPr>
-        <w:t xml:space="preserve">  "completeness": "complete",</w:t>
-      </w:r>
-    </w:p>
-    <w:p>
-      <w:pPr>
-        <w:shd w:val="clear" w:fill="F2F2F2"/>
-        <w:spacing w:after="0"/>
-        <w:ind w:left="113"/>
-      </w:pPr>
-      <w:r>
-        <w:rPr>
-          <w:rFonts w:ascii="Consolas" w:hAnsi="Consolas" w:eastAsia="Consolas"/>
-          <w:sz w:val="18"/>
-        </w:rPr>
-        <w:t xml:space="preserve">  "evidence": "我的整个CEO工具栈里全是我自己构建的应用。"</w:t>
-      </w:r>
-    </w:p>
-    <w:p>
-      <w:pPr>
-        <w:shd w:val="clear" w:fill="F2F2F2"/>
-        <w:spacing w:after="120"/>
-        <w:ind w:left="113"/>
-      </w:pPr>
-      <w:r>
-        <w:rPr>
-          <w:rFonts w:ascii="Consolas" w:hAnsi="Consolas" w:eastAsia="Consolas"/>
-          <w:sz w:val="18"/>
-        </w:rPr>
-        <w:t>}</w:t>
-      </w:r>
-    </w:p>
-    <w:p>
-      <w:pPr>
-        <w:spacing w:after="120"/>
-      </w:pPr>
-      <w:r>
-        <w:rPr>
-          <w:rFonts w:ascii="微软雅黑" w:hAnsi="微软雅黑" w:eastAsia="微软雅黑"/>
-          <w:sz w:val="21"/>
-        </w:rPr>
-        <w:t>Prompt 要求至少 3 个观点带 case；泛泛举例（“比如很多公司都这样”）填 null。</w:t>
-      </w:r>
-    </w:p>
-    <w:p>
-      <w:pPr>
-        <w:spacing w:after="120"/>
-      </w:pPr>
-      <w:r>
-        <w:rPr>
-          <w:rFonts w:ascii="微软雅黑" w:hAnsi="微软雅黑" w:eastAsia="微软雅黑"/>
-          <w:b/>
-          <w:sz w:val="21"/>
-        </w:rPr>
-        <w:t>编辑价值</w:t>
-      </w:r>
-      <w:r>
-        <w:rPr>
-          <w:rFonts w:ascii="微软雅黑" w:hAnsi="微软雅黑" w:eastAsia="微软雅黑"/>
-          <w:sz w:val="21"/>
-        </w:rPr>
-        <w:t>：completeness 标注直接告诉编辑——这个案例能不能直接写进文章？三要素完整（complete）的案例可以直接用；要素不全（partial）的需要编辑补背景或结果，或降级为一句引述；unknown 的不建议作为案例展开。前端详情弹窗中，案例以“背景/行动/结果”三段式展示，完整性以彩色徽标标注（绿色=完整、琥珀=需补、灰=仅只言片语），方便编辑在选素材时直接识别可用案例。</w:t>
       </w:r>
     </w:p>
     <w:p>
@@ -6288,18 +5524,6 @@
         <w:t>八、关键节点的质量 Rubric 汇总</w:t>
       </w:r>
     </w:p>
-    <w:p>
-      <w:pPr>
-        <w:spacing w:after="120"/>
-      </w:pPr>
-      <w:r>
-        <w:rPr>
-          <w:rFonts w:ascii="微软雅黑" w:hAnsi="微软雅黑" w:eastAsia="微软雅黑"/>
-          <w:sz w:val="21"/>
-        </w:rPr>
-        <w:t>每个指标都有可执行的操作刻度：怎么打分、测什么、通过线在哪。编辑不需要凭感觉判断“好不好”。</w:t>
-      </w:r>
-    </w:p>
     <w:tbl>
       <w:tblPr>
         <w:tblStyle w:val="TableGrid"/>
@@ -6308,15 +5532,14 @@
         <w:tblLook w:firstColumn="1" w:firstRow="1" w:lastColumn="0" w:lastRow="0" w:noHBand="0" w:noVBand="1" w:val="04A0"/>
       </w:tblPr>
       <w:tblGrid>
-        <w:gridCol w:w="2160"/>
-        <w:gridCol w:w="2160"/>
-        <w:gridCol w:w="2160"/>
-        <w:gridCol w:w="2160"/>
+        <w:gridCol w:w="2880"/>
+        <w:gridCol w:w="2880"/>
+        <w:gridCol w:w="2880"/>
       </w:tblGrid>
       <w:tr>
         <w:tc>
           <w:tcPr>
-            <w:tcW w:type="dxa" w:w="1587"/>
+            <w:tcW w:type="dxa" w:w="1928"/>
             <w:shd w:val="clear" w:fill="1F3A5F"/>
           </w:tcPr>
           <w:p>
@@ -6333,7 +5556,7 @@
         </w:tc>
         <w:tc>
           <w:tcPr>
-            <w:tcW w:type="dxa" w:w="1928"/>
+            <w:tcW w:type="dxa" w:w="4082"/>
             <w:shd w:val="clear" w:fill="1F3A5F"/>
           </w:tcPr>
           <w:p>
@@ -6350,7 +5573,7 @@
         </w:tc>
         <w:tc>
           <w:tcPr>
-            <w:tcW w:type="dxa" w:w="3515"/>
+            <w:tcW w:type="dxa" w:w="3402"/>
             <w:shd w:val="clear" w:fill="1F3A5F"/>
           </w:tcPr>
           <w:p>
@@ -6361,24 +5584,7 @@
                 <w:color w:val="FFFFFF"/>
                 <w:sz w:val="19"/>
               </w:rPr>
-              <w:t>操作刻度（怎么打分）</w:t>
-            </w:r>
-          </w:p>
-        </w:tc>
-        <w:tc>
-          <w:tcPr>
-            <w:tcW w:type="dxa" w:w="2381"/>
-            <w:shd w:val="clear" w:fill="1F3A5F"/>
-          </w:tcPr>
-          <w:p>
-            <w:r>
-              <w:rPr>
-                <w:rFonts w:ascii="微软雅黑" w:hAnsi="微软雅黑" w:eastAsia="微软雅黑"/>
-                <w:b/>
-                <w:color w:val="FFFFFF"/>
-                <w:sz w:val="19"/>
-              </w:rPr>
-              <w:t>通过标准</w:t>
+              <w:t>测量方式</w:t>
             </w:r>
           </w:p>
         </w:tc>
@@ -6386,7 +5592,7 @@
       <w:tr>
         <w:tc>
           <w:tcPr>
-            <w:tcW w:type="dxa" w:w="1587"/>
+            <w:tcW w:type="dxa" w:w="1928"/>
           </w:tcPr>
           <w:p>
             <w:r>
@@ -6400,7 +5606,7 @@
         </w:tc>
         <w:tc>
           <w:tcPr>
-            <w:tcW w:type="dxa" w:w="1928"/>
+            <w:tcW w:type="dxa" w:w="4082"/>
           </w:tcPr>
           <w:p>
             <w:r>
@@ -6408,13 +5614,13 @@
                 <w:rFonts w:ascii="微软雅黑" w:hAnsi="微软雅黑" w:eastAsia="微软雅黑"/>
                 <w:sz w:val="19"/>
               </w:rPr>
-              <w:t>观点密度、证据覆盖、分类准确</w:t>
+              <w:t>观点密度（每节点独立判断力）、证据覆盖（每条可溯源）、分类准确</w:t>
             </w:r>
           </w:p>
         </w:tc>
         <w:tc>
           <w:tcPr>
-            <w:tcW w:type="dxa" w:w="3515"/>
+            <w:tcW w:type="dxa" w:w="3402"/>
           </w:tcPr>
           <w:p>
             <w:r>
@@ -6422,21 +5628,7 @@
                 <w:rFonts w:ascii="微软雅黑" w:hAnsi="微软雅黑" w:eastAsia="微软雅黑"/>
                 <w:sz w:val="19"/>
               </w:rPr>
-              <w:t>LLM-as-judge 对每个节点打 1-5 分（能否回原文、分类是否合理）；随机抽 30% 节点反向定位原文；统计泛化句（“AI很重要”类）占比</w:t>
-            </w:r>
-          </w:p>
-        </w:tc>
-        <w:tc>
-          <w:tcPr>
-            <w:tcW w:type="dxa" w:w="2381"/>
-          </w:tcPr>
-          <w:p>
-            <w:r>
-              <w:rPr>
-                <w:rFonts w:ascii="微软雅黑" w:hAnsi="微软雅黑" w:eastAsia="微软雅黑"/>
-                <w:sz w:val="19"/>
-              </w:rPr>
-              <w:t>密度均分 ≥4；回源率 ≥90%；分类合理率 ≥80%；泛化句占比 &lt;10%</w:t>
+              <w:t>LLM-as-judge：另一个 LLM 独立检查每个节点是否能回原文、分类是否合理</w:t>
             </w:r>
           </w:p>
         </w:tc>
@@ -6444,7 +5636,7 @@
       <w:tr>
         <w:tc>
           <w:tcPr>
-            <w:tcW w:type="dxa" w:w="1587"/>
+            <w:tcW w:type="dxa" w:w="1928"/>
             <w:shd w:val="clear" w:fill="EDF1F7"/>
           </w:tcPr>
           <w:p>
@@ -6459,7 +5651,7 @@
         </w:tc>
         <w:tc>
           <w:tcPr>
-            <w:tcW w:type="dxa" w:w="1928"/>
+            <w:tcW w:type="dxa" w:w="4082"/>
             <w:shd w:val="clear" w:fill="EDF1F7"/>
           </w:tcPr>
           <w:p>
@@ -6468,13 +5660,13 @@
                 <w:rFonts w:ascii="微软雅黑" w:hAnsi="微软雅黑" w:eastAsia="微软雅黑"/>
                 <w:sz w:val="19"/>
               </w:rPr>
-              <w:t>陷阱检测、时效判断、可用性判定</w:t>
+              <w:t>陷阱检测率（note_02 是否被正确识别）、时效判断准确率</w:t>
             </w:r>
           </w:p>
         </w:tc>
         <w:tc>
           <w:tcPr>
-            <w:tcW w:type="dxa" w:w="3515"/>
+            <w:tcW w:type="dxa" w:w="3402"/>
             <w:shd w:val="clear" w:fill="EDF1F7"/>
           </w:tcPr>
           <w:p>
@@ -6483,22 +5675,7 @@
                 <w:rFonts w:ascii="微软雅黑" w:hAnsi="微软雅黑" w:eastAsia="微软雅黑"/>
                 <w:sz w:val="19"/>
               </w:rPr>
-              <w:t>检查 note_02 是否标记“同一场/不复用”；检查 &gt;1 年笔记是否标“仅背景参考”；逐条检查判断理由是否具体</w:t>
-            </w:r>
-          </w:p>
-        </w:tc>
-        <w:tc>
-          <w:tcPr>
-            <w:tcW w:type="dxa" w:w="2381"/>
-            <w:shd w:val="clear" w:fill="EDF1F7"/>
-          </w:tcPr>
-          <w:p>
-            <w:r>
-              <w:rPr>
-                <w:rFonts w:ascii="微软雅黑" w:hAnsi="微软雅黑" w:eastAsia="微软雅黑"/>
-                <w:sz w:val="19"/>
-              </w:rPr>
-              <w:t>note_02 识别率 100%（漏检即不通过）；过时标注率 100%；理由为空条目 = 0</w:t>
+              <w:t>编辑人工审核</w:t>
             </w:r>
           </w:p>
         </w:tc>
@@ -6506,7 +5683,7 @@
       <w:tr>
         <w:tc>
           <w:tcPr>
-            <w:tcW w:type="dxa" w:w="1587"/>
+            <w:tcW w:type="dxa" w:w="1928"/>
           </w:tcPr>
           <w:p>
             <w:r>
@@ -6520,7 +5697,7 @@
         </w:tc>
         <w:tc>
           <w:tcPr>
-            <w:tcW w:type="dxa" w:w="1928"/>
+            <w:tcW w:type="dxa" w:w="4082"/>
           </w:tcPr>
           <w:p>
             <w:r>
@@ -6534,21 +5711,7 @@
         </w:tc>
         <w:tc>
           <w:tcPr>
-            <w:tcW w:type="dxa" w:w="3515"/>
-          </w:tcPr>
-          <w:p>
-            <w:r>
-              <w:rPr>
-                <w:rFonts w:ascii="微软雅黑" w:hAnsi="微软雅黑" w:eastAsia="微软雅黑"/>
-                <w:sz w:val="19"/>
-              </w:rPr>
-              <w:t>—</w:t>
-            </w:r>
-          </w:p>
-        </w:tc>
-        <w:tc>
-          <w:tcPr>
-            <w:tcW w:type="dxa" w:w="2381"/>
+            <w:tcW w:type="dxa" w:w="3402"/>
           </w:tcPr>
           <w:p>
             <w:r>
@@ -6564,7 +5727,7 @@
       <w:tr>
         <w:tc>
           <w:tcPr>
-            <w:tcW w:type="dxa" w:w="1587"/>
+            <w:tcW w:type="dxa" w:w="1928"/>
             <w:shd w:val="clear" w:fill="EDF1F7"/>
           </w:tcPr>
           <w:p>
@@ -6579,7 +5742,7 @@
         </w:tc>
         <w:tc>
           <w:tcPr>
-            <w:tcW w:type="dxa" w:w="1928"/>
+            <w:tcW w:type="dxa" w:w="4082"/>
             <w:shd w:val="clear" w:fill="EDF1F7"/>
           </w:tcPr>
           <w:p>
@@ -6588,13 +5751,13 @@
                 <w:rFonts w:ascii="微软雅黑" w:hAnsi="微软雅黑" w:eastAsia="微软雅黑"/>
                 <w:sz w:val="19"/>
               </w:rPr>
-              <w:t>风格一致、证据保真、结构可用、判断保留</w:t>
+              <w:t>风格一致性、证据保真、结构可用性</w:t>
             </w:r>
           </w:p>
         </w:tc>
         <w:tc>
           <w:tcPr>
-            <w:tcW w:type="dxa" w:w="3515"/>
+            <w:tcW w:type="dxa" w:w="3402"/>
             <w:shd w:val="clear" w:fill="EDF1F7"/>
           </w:tcPr>
           <w:p>
@@ -6603,22 +5766,7 @@
                 <w:rFonts w:ascii="微软雅黑" w:hAnsi="微软雅黑" w:eastAsia="微软雅黑"/>
                 <w:sz w:val="19"/>
               </w:rPr>
-              <w:t>编辑按 1-5 打风格分；随机抽 20% 论述反向定位到观点节点；统计“在当今时代”类 AI 味开头次数；核对是否有语气升级（“也许”改“一定”）</w:t>
-            </w:r>
-          </w:p>
-        </w:tc>
-        <w:tc>
-          <w:tcPr>
-            <w:tcW w:type="dxa" w:w="2381"/>
-            <w:shd w:val="clear" w:fill="EDF1F7"/>
-          </w:tcPr>
-          <w:p>
-            <w:r>
-              <w:rPr>
-                <w:rFonts w:ascii="微软雅黑" w:hAnsi="微软雅黑" w:eastAsia="微软雅黑"/>
-                <w:sz w:val="19"/>
-              </w:rPr>
-              <w:t>风格 ≥4 分；定位率 100%；AI 味开头 ≤1 次；语气升级 = 不通过；结构 10 分钟可改</w:t>
+              <w:t>编辑主观评分 + LLM 比对草稿 vs 观点节点的语义偏移量</w:t>
             </w:r>
           </w:p>
         </w:tc>
@@ -6626,7 +5774,7 @@
       <w:tr>
         <w:tc>
           <w:tcPr>
-            <w:tcW w:type="dxa" w:w="1587"/>
+            <w:tcW w:type="dxa" w:w="1928"/>
           </w:tcPr>
           <w:p>
             <w:r>
@@ -6640,7 +5788,7 @@
         </w:tc>
         <w:tc>
           <w:tcPr>
-            <w:tcW w:type="dxa" w:w="1928"/>
+            <w:tcW w:type="dxa" w:w="4082"/>
           </w:tcPr>
           <w:p>
             <w:r>
@@ -6648,13 +5796,13 @@
                 <w:rFonts w:ascii="微软雅黑" w:hAnsi="微软雅黑" w:eastAsia="微软雅黑"/>
                 <w:sz w:val="19"/>
               </w:rPr>
-              <w:t>内检覆盖率、误报率、外检溯源、可操作性</w:t>
+              <w:t>内检覆盖率、误报率、外检溯源完整性</w:t>
             </w:r>
           </w:p>
         </w:tc>
         <w:tc>
           <w:tcPr>
-            <w:tcW w:type="dxa" w:w="3515"/>
+            <w:tcW w:type="dxa" w:w="3402"/>
           </w:tcPr>
           <w:p>
             <w:r>
@@ -6662,21 +5810,7 @@
                 <w:rFonts w:ascii="微软雅黑" w:hAnsi="微软雅黑" w:eastAsia="微软雅黑"/>
                 <w:sz w:val="19"/>
               </w:rPr>
-              <w:t>统计带时间戳论述的比对率；编辑复核标注后统计“狼来了”占比；检查每条外检结论是否有来源链接；检查每条标注是否有“建议动作”</w:t>
-            </w:r>
-          </w:p>
-        </w:tc>
-        <w:tc>
-          <w:tcPr>
-            <w:tcW w:type="dxa" w:w="2381"/>
-          </w:tcPr>
-          <w:p>
-            <w:r>
-              <w:rPr>
-                <w:rFonts w:ascii="微软雅黑" w:hAnsi="微软雅黑" w:eastAsia="微软雅黑"/>
-                <w:sz w:val="19"/>
-              </w:rPr>
-              <w:t>覆盖率 100%；误报率 &lt;20%；无链接 = 不通过；缺建议动作 = 不通过</w:t>
+              <w:t>编辑审核标注是否准确</w:t>
             </w:r>
           </w:p>
         </w:tc>
@@ -6684,7 +5818,7 @@
       <w:tr>
         <w:tc>
           <w:tcPr>
-            <w:tcW w:type="dxa" w:w="1587"/>
+            <w:tcW w:type="dxa" w:w="1928"/>
             <w:shd w:val="clear" w:fill="EDF1F7"/>
           </w:tcPr>
           <w:p>
@@ -6699,7 +5833,7 @@
         </w:tc>
         <w:tc>
           <w:tcPr>
-            <w:tcW w:type="dxa" w:w="1928"/>
+            <w:tcW w:type="dxa" w:w="4082"/>
             <w:shd w:val="clear" w:fill="EDF1F7"/>
           </w:tcPr>
           <w:p>
@@ -6708,13 +5842,13 @@
                 <w:rFonts w:ascii="微软雅黑" w:hAnsi="微软雅黑" w:eastAsia="微软雅黑"/>
                 <w:sz w:val="19"/>
               </w:rPr>
-              <w:t>观点密度、读者匹配、证据可溯源</w:t>
+              <w:t>观点密度、目标读者匹配度、证据可溯源</w:t>
             </w:r>
           </w:p>
         </w:tc>
         <w:tc>
           <w:tcPr>
-            <w:tcW w:type="dxa" w:w="3515"/>
+            <w:tcW w:type="dxa" w:w="3402"/>
             <w:shd w:val="clear" w:fill="EDF1F7"/>
           </w:tcPr>
           <w:p>
@@ -6723,22 +5857,7 @@
                 <w:rFonts w:ascii="微软雅黑" w:hAnsi="微软雅黑" w:eastAsia="微软雅黑"/>
                 <w:sz w:val="19"/>
               </w:rPr>
-              <w:t>编辑终审 + 读者抽读反馈</w:t>
-            </w:r>
-          </w:p>
-        </w:tc>
-        <w:tc>
-          <w:tcPr>
-            <w:tcW w:type="dxa" w:w="2381"/>
-            <w:shd w:val="clear" w:fill="EDF1F7"/>
-          </w:tcPr>
-          <w:p>
-            <w:r>
-              <w:rPr>
-                <w:rFonts w:ascii="微软雅黑" w:hAnsi="微软雅黑" w:eastAsia="微软雅黑"/>
-                <w:sz w:val="19"/>
-              </w:rPr>
-              <w:t>编辑通过 + 读者能追溯关键结论到原文（抽读可溯源率 ≥90%）</w:t>
+              <w:t>编辑终审 + 读者反馈</w:t>
             </w:r>
           </w:p>
         </w:tc>

</xml_diff>